<commit_message>
Harmonic: center-align Measurement Data table + remove cell padding
Center-align (horizontal + vertical) the data-loop rows of the Harmonic
tables to match their headers and the reference doc, and set the Measurement
Data cell paragraphs to zero space before/after with single line spacing so
there is no top/bottom padding.

Co-Authored-By: Claude Opus 4.8 (1M context) <noreply@anthropic.com>
</commit_message>
<xml_diff>
--- a/datasheet_gen/word_templates/HARMONIC.docx
+++ b/datasheet_gen/word_templates/HARMONIC.docx
@@ -646,8 +646,12 @@
         <w:tc>
           <w:tcPr>
             <w:tcW w:type="dxa" w:w="2254"/>
-          </w:tcPr>
-          <w:p>
+            <w:vAlign w:val="center"/>
+          </w:tcPr>
+          <w:p>
+            <w:pPr>
+              <w:jc w:val="center"/>
+            </w:pPr>
             <w:r>
               <w:rPr>
                 <w:rFonts w:ascii="Arial" w:hAnsi="Arial" w:cs="Arial"/>
@@ -661,8 +665,12 @@
         <w:tc>
           <w:tcPr>
             <w:tcW w:type="dxa" w:w="2254"/>
-          </w:tcPr>
-          <w:p>
+            <w:vAlign w:val="center"/>
+          </w:tcPr>
+          <w:p>
+            <w:pPr>
+              <w:jc w:val="center"/>
+            </w:pPr>
             <w:r>
               <w:rPr>
                 <w:rFonts w:ascii="Arial" w:hAnsi="Arial" w:cs="Arial"/>
@@ -676,8 +684,12 @@
         <w:tc>
           <w:tcPr>
             <w:tcW w:type="dxa" w:w="2254"/>
-          </w:tcPr>
-          <w:p>
+            <w:vAlign w:val="center"/>
+          </w:tcPr>
+          <w:p>
+            <w:pPr>
+              <w:jc w:val="center"/>
+            </w:pPr>
             <w:r>
               <w:rPr>
                 <w:rFonts w:ascii="Arial" w:hAnsi="Arial" w:cs="Arial"/>
@@ -691,8 +703,12 @@
         <w:tc>
           <w:tcPr>
             <w:tcW w:type="dxa" w:w="2254"/>
-          </w:tcPr>
-          <w:p>
+            <w:vAlign w:val="center"/>
+          </w:tcPr>
+          <w:p>
+            <w:pPr>
+              <w:jc w:val="center"/>
+            </w:pPr>
             <w:r>
               <w:rPr>
                 <w:rFonts w:ascii="Arial" w:hAnsi="Arial" w:cs="Arial"/>
@@ -1931,6 +1947,9 @@
             <w:hideMark/>
           </w:tcPr>
           <w:p>
+            <w:pPr>
+              <w:jc w:val="center"/>
+            </w:pPr>
             <w:r>
               <w:rPr>
                 <w:rFonts w:ascii="Arial" w:hAnsi="Arial" w:cs="Arial"/>
@@ -1960,6 +1979,9 @@
             <w:hideMark/>
           </w:tcPr>
           <w:p>
+            <w:pPr>
+              <w:jc w:val="center"/>
+            </w:pPr>
             <w:r>
               <w:rPr>
                 <w:rFonts w:ascii="Arial" w:hAnsi="Arial" w:cs="Arial"/>
@@ -1988,6 +2010,9 @@
             <w:vAlign w:val="center"/>
           </w:tcPr>
           <w:p>
+            <w:pPr>
+              <w:jc w:val="center"/>
+            </w:pPr>
             <w:r>
               <w:rPr>
                 <w:rFonts w:ascii="Arial" w:hAnsi="Arial" w:cs="Arial"/>
@@ -2016,6 +2041,9 @@
             <w:vAlign w:val="center"/>
           </w:tcPr>
           <w:p>
+            <w:pPr>
+              <w:jc w:val="center"/>
+            </w:pPr>
             <w:r>
               <w:rPr>
                 <w:rFonts w:ascii="Arial" w:hAnsi="Arial" w:cs="Arial"/>
@@ -2044,6 +2072,9 @@
             <w:vAlign w:val="center"/>
           </w:tcPr>
           <w:p>
+            <w:pPr>
+              <w:jc w:val="center"/>
+            </w:pPr>
             <w:r>
               <w:rPr>
                 <w:rFonts w:ascii="Arial" w:hAnsi="Arial" w:cs="Arial"/>
@@ -2073,6 +2104,9 @@
             <w:hideMark/>
           </w:tcPr>
           <w:p>
+            <w:pPr>
+              <w:jc w:val="center"/>
+            </w:pPr>
             <w:r>
               <w:rPr>
                 <w:rFonts w:ascii="Arial" w:hAnsi="Arial" w:cs="Arial"/>
@@ -2101,6 +2135,9 @@
             <w:vAlign w:val="center"/>
           </w:tcPr>
           <w:p>
+            <w:pPr>
+              <w:jc w:val="center"/>
+            </w:pPr>
             <w:r>
               <w:rPr>
                 <w:rFonts w:ascii="Arial" w:hAnsi="Arial" w:cs="Arial"/>
@@ -2129,6 +2166,9 @@
             <w:vAlign w:val="center"/>
           </w:tcPr>
           <w:p>
+            <w:pPr>
+              <w:jc w:val="center"/>
+            </w:pPr>
             <w:r>
               <w:rPr>
                 <w:rFonts w:ascii="Arial" w:hAnsi="Arial" w:cs="Arial"/>
@@ -2157,6 +2197,9 @@
             <w:vAlign w:val="center"/>
           </w:tcPr>
           <w:p>
+            <w:pPr>
+              <w:jc w:val="center"/>
+            </w:pPr>
             <w:r>
               <w:rPr>
                 <w:rFonts w:ascii="Arial" w:hAnsi="Arial" w:cs="Arial"/>
@@ -2185,6 +2228,9 @@
             <w:vAlign w:val="center"/>
           </w:tcPr>
           <w:p>
+            <w:pPr>
+              <w:jc w:val="center"/>
+            </w:pPr>
             <w:r>
               <w:rPr>
                 <w:rFonts w:ascii="Arial" w:hAnsi="Arial" w:cs="Arial"/>
@@ -3448,8 +3494,12 @@
         <w:tc>
           <w:tcPr>
             <w:tcW w:type="dxa" w:w="4248"/>
-          </w:tcPr>
-          <w:p>
+            <w:vAlign w:val="center"/>
+          </w:tcPr>
+          <w:p>
+            <w:pPr>
+              <w:jc w:val="center"/>
+            </w:pPr>
             <w:r>
               <w:rPr>
                 <w:rFonts w:ascii="Arial" w:hAnsi="Arial" w:cs="Arial"/>
@@ -3461,8 +3511,12 @@
         <w:tc>
           <w:tcPr>
             <w:tcW w:type="dxa" w:w="4768"/>
-          </w:tcPr>
-          <w:p>
+            <w:vAlign w:val="center"/>
+          </w:tcPr>
+          <w:p>
+            <w:pPr>
+              <w:jc w:val="center"/>
+            </w:pPr>
             <w:r>
               <w:rPr>
                 <w:rFonts w:ascii="Arial" w:hAnsi="Arial" w:cs="Arial"/>
@@ -3645,8 +3699,12 @@
         <w:tc>
           <w:tcPr>
             <w:tcW w:type="dxa" w:w="4248"/>
-          </w:tcPr>
-          <w:p>
+            <w:vAlign w:val="center"/>
+          </w:tcPr>
+          <w:p>
+            <w:pPr>
+              <w:jc w:val="center"/>
+            </w:pPr>
             <w:r>
               <w:rPr>
                 <w:rFonts w:ascii="Arial" w:hAnsi="Arial" w:cs="Arial"/>
@@ -3658,8 +3716,12 @@
         <w:tc>
           <w:tcPr>
             <w:tcW w:type="dxa" w:w="4768"/>
-          </w:tcPr>
-          <w:p>
+            <w:vAlign w:val="center"/>
+          </w:tcPr>
+          <w:p>
+            <w:pPr>
+              <w:jc w:val="center"/>
+            </w:pPr>
             <w:r>
               <w:rPr>
                 <w:rFonts w:ascii="Arial" w:hAnsi="Arial" w:cs="Arial"/>
@@ -3854,7 +3916,7 @@
           </w:tcPr>
           <w:p>
             <w:pPr>
-              <w:spacing w:after="0" w:line="240" w:lineRule="auto"/>
+              <w:spacing w:after="0" w:line="240" w:lineRule="auto" w:before="0"/>
               <w:jc w:val="center"/>
               <w:rPr>
                 <w:rFonts w:ascii="Arial" w:eastAsia="Times New Roman" w:hAnsi="Arial" w:cs="Arial"/>
@@ -3899,7 +3961,7 @@
           </w:tcPr>
           <w:p>
             <w:pPr>
-              <w:spacing w:after="0" w:line="240" w:lineRule="auto"/>
+              <w:spacing w:after="0" w:line="240" w:lineRule="auto" w:before="0"/>
               <w:jc w:val="center"/>
               <w:rPr>
                 <w:rFonts w:ascii="Arial" w:eastAsia="Times New Roman" w:hAnsi="Arial" w:cs="Arial"/>
@@ -3939,7 +4001,7 @@
           </w:tcPr>
           <w:p>
             <w:pPr>
-              <w:spacing w:after="0" w:line="240" w:lineRule="auto"/>
+              <w:spacing w:after="0" w:line="240" w:lineRule="auto" w:before="0"/>
               <w:jc w:val="center"/>
               <w:rPr>
                 <w:rFonts w:ascii="Arial" w:eastAsia="Times New Roman" w:hAnsi="Arial" w:cs="Arial"/>
@@ -4004,7 +4066,7 @@
           </w:tcPr>
           <w:p>
             <w:pPr>
-              <w:spacing w:after="0" w:line="240" w:lineRule="auto"/>
+              <w:spacing w:after="0" w:line="240" w:lineRule="auto" w:before="0"/>
               <w:jc w:val="center"/>
               <w:rPr>
                 <w:rFonts w:ascii="Arial" w:eastAsia="Times New Roman" w:hAnsi="Arial" w:cs="Arial"/>
@@ -4044,7 +4106,7 @@
           </w:tcPr>
           <w:p>
             <w:pPr>
-              <w:spacing w:after="0" w:line="240" w:lineRule="auto"/>
+              <w:spacing w:after="0" w:line="240" w:lineRule="auto" w:before="0"/>
               <w:jc w:val="center"/>
               <w:rPr>
                 <w:rFonts w:ascii="Arial" w:eastAsia="Times New Roman" w:hAnsi="Arial" w:cs="Arial"/>
@@ -4089,7 +4151,7 @@
           </w:tcPr>
           <w:p>
             <w:pPr>
-              <w:spacing w:after="0" w:line="240" w:lineRule="auto"/>
+              <w:spacing w:after="0" w:line="240" w:lineRule="auto" w:before="0"/>
               <w:jc w:val="center"/>
               <w:rPr>
                 <w:rFonts w:ascii="Arial" w:eastAsia="Times New Roman" w:hAnsi="Arial" w:cs="Arial"/>
@@ -4118,7 +4180,7 @@
           </w:tcPr>
           <w:p>
             <w:pPr>
-              <w:spacing w:after="0" w:line="240" w:lineRule="auto"/>
+              <w:spacing w:after="0" w:line="240" w:lineRule="auto" w:before="0"/>
               <w:jc w:val="center"/>
               <w:rPr>
                 <w:rFonts w:ascii="Arial" w:eastAsia="Times New Roman" w:hAnsi="Arial" w:cs="Arial"/>
@@ -4145,7 +4207,7 @@
           </w:tcPr>
           <w:p>
             <w:pPr>
-              <w:spacing w:after="0" w:line="240" w:lineRule="auto"/>
+              <w:spacing w:after="0" w:line="240" w:lineRule="auto" w:before="0"/>
               <w:jc w:val="center"/>
               <w:rPr>
                 <w:rFonts w:ascii="Arial" w:eastAsia="Times New Roman" w:hAnsi="Arial" w:cs="Arial"/>
@@ -4172,7 +4234,7 @@
           </w:tcPr>
           <w:p>
             <w:pPr>
-              <w:spacing w:after="0" w:line="240" w:lineRule="auto"/>
+              <w:spacing w:after="0" w:line="240" w:lineRule="auto" w:before="0"/>
               <w:jc w:val="center"/>
               <w:rPr>
                 <w:rFonts w:ascii="Arial" w:eastAsia="Times New Roman" w:hAnsi="Arial" w:cs="Arial"/>
@@ -4196,8 +4258,13 @@
               <w:bottom w:val="single" w:sz="6" w:space="0" w:color="A9A9A9"/>
               <w:right w:val="single" w:sz="6" w:space="0" w:color="A9A9A9"/>
             </w:tcBorders>
-          </w:tcPr>
-          <w:p>
+            <w:vAlign w:val="center"/>
+          </w:tcPr>
+          <w:p>
+            <w:pPr>
+              <w:spacing w:before="0" w:after="0" w:line="240" w:lineRule="auto"/>
+              <w:jc w:val="center"/>
+            </w:pPr>
             <w:r>
               <w:rPr>
                 <w:rFonts w:ascii="Arial" w:hAnsi="Arial" w:cs="Arial"/>
@@ -4215,8 +4282,13 @@
               <w:bottom w:val="single" w:sz="6" w:space="0" w:color="A9A9A9"/>
               <w:right w:val="single" w:sz="6" w:space="0" w:color="A9A9A9"/>
             </w:tcBorders>
-          </w:tcPr>
-          <w:p>
+            <w:vAlign w:val="center"/>
+          </w:tcPr>
+          <w:p>
+            <w:pPr>
+              <w:spacing w:before="0" w:after="0" w:line="240" w:lineRule="auto"/>
+              <w:jc w:val="center"/>
+            </w:pPr>
             <w:r>
               <w:rPr>
                 <w:rFonts w:ascii="Arial" w:hAnsi="Arial" w:cs="Arial"/>
@@ -4234,8 +4306,13 @@
               <w:bottom w:val="single" w:sz="6" w:space="0" w:color="A9A9A9"/>
               <w:right w:val="single" w:sz="6" w:space="0" w:color="A9A9A9"/>
             </w:tcBorders>
-          </w:tcPr>
-          <w:p>
+            <w:vAlign w:val="center"/>
+          </w:tcPr>
+          <w:p>
+            <w:pPr>
+              <w:spacing w:before="0" w:after="0" w:line="240" w:lineRule="auto"/>
+              <w:jc w:val="center"/>
+            </w:pPr>
             <w:r>
               <w:rPr>
                 <w:rFonts w:ascii="Arial" w:hAnsi="Arial" w:cs="Arial"/>
@@ -4253,8 +4330,13 @@
               <w:bottom w:val="single" w:sz="6" w:space="0" w:color="A9A9A9"/>
               <w:right w:val="single" w:sz="6" w:space="0" w:color="A9A9A9"/>
             </w:tcBorders>
-          </w:tcPr>
-          <w:p>
+            <w:vAlign w:val="center"/>
+          </w:tcPr>
+          <w:p>
+            <w:pPr>
+              <w:spacing w:before="0" w:after="0" w:line="240" w:lineRule="auto"/>
+              <w:jc w:val="center"/>
+            </w:pPr>
             <w:r>
               <w:rPr>
                 <w:rFonts w:ascii="Arial" w:hAnsi="Arial" w:cs="Arial"/>
@@ -4270,6 +4352,9 @@
             <w:tcW w:type="dxa" w:w="2946"/>
           </w:tcPr>
           <w:p>
+            <w:pPr>
+              <w:spacing w:before="0" w:after="0" w:line="240" w:lineRule="auto"/>
+            </w:pPr>
             <w:r>
               <w:t>{%tr endfor %}</w:t>
             </w:r>
@@ -4279,19 +4364,31 @@
           <w:tcPr>
             <w:tcW w:type="dxa" w:w="1946"/>
           </w:tcPr>
-          <w:p/>
+          <w:p>
+            <w:pPr>
+              <w:spacing w:before="0" w:after="0" w:line="240" w:lineRule="auto"/>
+            </w:pPr>
+          </w:p>
         </w:tc>
         <w:tc>
           <w:tcPr>
             <w:tcW w:type="dxa" w:w="2034"/>
           </w:tcPr>
-          <w:p/>
+          <w:p>
+            <w:pPr>
+              <w:spacing w:before="0" w:after="0" w:line="240" w:lineRule="auto"/>
+            </w:pPr>
+          </w:p>
         </w:tc>
         <w:tc>
           <w:tcPr>
             <w:tcW w:type="dxa" w:w="2090"/>
           </w:tcPr>
-          <w:p/>
+          <w:p>
+            <w:pPr>
+              <w:spacing w:before="0" w:after="0" w:line="240" w:lineRule="auto"/>
+            </w:pPr>
+          </w:p>
         </w:tc>
       </w:tr>
     </w:tbl>
@@ -4937,8 +5034,12 @@
         <w:tc>
           <w:tcPr>
             <w:tcW w:type="dxa" w:w="1803"/>
-          </w:tcPr>
-          <w:p>
+            <w:vAlign w:val="center"/>
+          </w:tcPr>
+          <w:p>
+            <w:pPr>
+              <w:jc w:val="center"/>
+            </w:pPr>
             <w:r>
               <w:rPr>
                 <w:rFonts w:ascii="Arial" w:hAnsi="Arial" w:cs="Arial"/>
@@ -4950,8 +5051,12 @@
         <w:tc>
           <w:tcPr>
             <w:tcW w:type="dxa" w:w="1803"/>
-          </w:tcPr>
-          <w:p>
+            <w:vAlign w:val="center"/>
+          </w:tcPr>
+          <w:p>
+            <w:pPr>
+              <w:jc w:val="center"/>
+            </w:pPr>
             <w:r>
               <w:rPr>
                 <w:rFonts w:ascii="Arial" w:hAnsi="Arial" w:cs="Arial"/>
@@ -4963,8 +5068,12 @@
         <w:tc>
           <w:tcPr>
             <w:tcW w:type="dxa" w:w="1803"/>
-          </w:tcPr>
-          <w:p>
+            <w:vAlign w:val="center"/>
+          </w:tcPr>
+          <w:p>
+            <w:pPr>
+              <w:jc w:val="center"/>
+            </w:pPr>
             <w:r>
               <w:rPr>
                 <w:rFonts w:ascii="Arial" w:hAnsi="Arial" w:cs="Arial"/>
@@ -4976,8 +5085,12 @@
         <w:tc>
           <w:tcPr>
             <w:tcW w:type="dxa" w:w="1803"/>
-          </w:tcPr>
-          <w:p>
+            <w:vAlign w:val="center"/>
+          </w:tcPr>
+          <w:p>
+            <w:pPr>
+              <w:jc w:val="center"/>
+            </w:pPr>
             <w:r>
               <w:rPr>
                 <w:rFonts w:ascii="Arial" w:hAnsi="Arial" w:cs="Arial"/>
@@ -4989,8 +5102,12 @@
         <w:tc>
           <w:tcPr>
             <w:tcW w:type="dxa" w:w="1804"/>
-          </w:tcPr>
-          <w:p>
+            <w:vAlign w:val="center"/>
+          </w:tcPr>
+          <w:p>
+            <w:pPr>
+              <w:jc w:val="center"/>
+            </w:pPr>
             <w:r>
               <w:rPr>
                 <w:rFonts w:ascii="Arial" w:hAnsi="Arial" w:cs="Arial"/>
@@ -5192,8 +5309,12 @@
         <w:tc>
           <w:tcPr>
             <w:tcW w:type="dxa" w:w="4510"/>
-          </w:tcPr>
-          <w:p>
+            <w:vAlign w:val="center"/>
+          </w:tcPr>
+          <w:p>
+            <w:pPr>
+              <w:jc w:val="center"/>
+            </w:pPr>
             <w:r>
               <w:rPr>
                 <w:rFonts w:ascii="Arial" w:hAnsi="Arial" w:cs="Arial"/>
@@ -5205,8 +5326,12 @@
         <w:tc>
           <w:tcPr>
             <w:tcW w:type="dxa" w:w="4506"/>
-          </w:tcPr>
-          <w:p>
+            <w:vAlign w:val="center"/>
+          </w:tcPr>
+          <w:p>
+            <w:pPr>
+              <w:jc w:val="center"/>
+            </w:pPr>
             <w:r>
               <w:rPr>
                 <w:rFonts w:ascii="Arial" w:hAnsi="Arial" w:cs="Arial"/>

</xml_diff>